<commit_message>
Remove duplicated AI judge prompt from methods supplement
</commit_message>
<xml_diff>
--- a/evaluation/publication_results/manuscript_package_20260719/tirs_final_submission_package_20260720/submission_upload_files_20260720/05_Supplementary_Tables_20260720.docx
+++ b/evaluation/publication_results/manuscript_package_20260719/tirs_final_submission_package_20260720/submission_upload_files_20260720/05_Supplementary_Tables_20260720.docx
@@ -5,7 +5,6 @@
     <w:p>
       <w:pPr>
         <w:pStyle w:val="Heading1"/>
-        <w:jc w:val="left"/>
       </w:pPr>
       <w:r>
         <w:t>Supplementary Tables</w:t>
@@ -13,23 +12,11 @@
     </w:p>
     <w:p>
       <w:r>
-        <w:rPr>
-          <w:rFonts w:ascii="Arial" w:hAnsi="Arial"/>
-          <w:b w:val="0"/>
-          <w:i w:val="0"/>
-          <w:sz w:val="22"/>
-        </w:rPr>
         <w:t>Title: Bilingual Retrieval-Augmented Access to ANVISA Regulatory Documents</w:t>
       </w:r>
     </w:p>
     <w:p>
       <w:r>
-        <w:rPr>
-          <w:rFonts w:ascii="Arial" w:hAnsi="Arial"/>
-          <w:b w:val="0"/>
-          <w:i w:val="0"/>
-          <w:sz w:val="22"/>
-        </w:rPr>
         <w:t>Prepared: 2026-07-20</w:t>
       </w:r>
     </w:p>
@@ -2126,7 +2113,7 @@
                 <w:b w:val="0"/>
                 <w:sz w:val="17"/>
               </w:rPr>
-              <w:t>Course notebook file and repository copy `notebooks/1_LLM.ipynb`</w:t>
+              <w:t>Course notebook file and repository copy notebooks/1_LLM.ipynb</w:t>
             </w:r>
           </w:p>
         </w:tc>
@@ -2206,7 +2193,7 @@
                 <w:b w:val="0"/>
                 <w:sz w:val="17"/>
               </w:rPr>
-              <w:t>Course notebook file and repository copy `notebooks/2_chatbot.ipynb`</w:t>
+              <w:t>Course notebook file and repository copy notebooks/2_chatbot.ipynb</w:t>
             </w:r>
           </w:p>
         </w:tc>
@@ -2286,7 +2273,7 @@
                 <w:b w:val="0"/>
                 <w:sz w:val="17"/>
               </w:rPr>
-              <w:t>Course notebook file and repository copy `notebooks/3_rag.ipynb`</w:t>
+              <w:t>Course notebook file and repository copy notebooks/3_rag.ipynb</w:t>
             </w:r>
           </w:p>
         </w:tc>

</xml_diff>